<commit_message>
Revise submission package (round 2): precision, figure, tables, metadata
- Claim-quotation-interpretation structure restored for all 27 quotations
- Essential methods and analysis detail restored; non-pursuit limitation added
- Figure 1: documentation count moved outside resource branch; pathway note
- Precision edits (substantiation wording, local action, framework, novelty)
- Fricker framed as cautious lens; Table 1 'Value' header and footnote
- Table 2 rows kept together; SRQR S4 location; personal metadata removed

Co-Authored-By: Claude Opus 5.5 <noreply@anthropic.com>
Claude-Session: https://claude.ai/code/session_01UT78gQUt5oK3YcdBNhPoiC
</commit_message>
<xml_diff>
--- a/submission_applied_nursing_research/01_Cover_Letter.docx
+++ b/submission_applied_nursing_research/01_Cover_Letter.docx
@@ -102,7 +102,7 @@
         <w:pStyle w:val="BodyText"/>
       </w:pPr>
       <w:r>
-        <w:t xml:space="preserve">Nurse managers routinely receive concerns from nurses at times when their unit dashboards look reassuring. Speaking-up research has focused mainly on the person raising a concern; much less is known about how the receiving manager decides whether a concern warrants investigation, and who must supply the evidence. Using interpretive description with 23 nurse managers in six Saudi public hospitals, we found that:</w:t>
+        <w:t xml:space="preserve">Nurse managers routinely receive concerns from nurses at times when their unit dashboards look reassuring. Speaking-up research has focused mainly on the person raising a concern; how the receiving manager decides whether a concern warrants investigation, and who must supply any further evidence, remains insufficiently understood. Using interpretive description with 23 nurse managers in six Saudi public hospitals, we found that:</w:t>
       </w:r>
     </w:p>
     <w:p>
@@ -144,7 +144,7 @@
         </w:numPr>
       </w:pPr>
       <w:r>
-        <w:t xml:space="preserve">the burden of proof was conditional: bedside risks prompted immediate inquiry, whereas resource-related concerns required documentation or numerical justification, which could pass down from senior managers to the nurse who raised the concern; and</w:t>
+        <w:t xml:space="preserve">the burden of proof was conditional: immediate clinical risks prompted assessment without requiring additional substantiation, whereas resource-related concerns often required documentation or numerical justification, which could pass down from senior managers to the nurse who raised the concern; and</w:t>
       </w:r>
     </w:p>
     <w:p>
@@ -164,7 +164,7 @@
         <w:pStyle w:val="FirstParagraph"/>
       </w:pPr>
       <w:r>
-        <w:t xml:space="preserve">The paper translates these findings into a proposed practice framework (Table 3) for quality meetings, follow-up standards and manager education. We believe it fits the journal’s focus on research that informs nursing practice and builds on recent work in the journal on nurses’ safety voice (Ahn, 2026).</w:t>
+        <w:t xml:space="preserve">A conceptual model (Fig. 1) summarises these relationships, and a proposed, untested practice framework (Table 3) offers questions for quality meetings, follow-up standards and manager education. We believe it fits the journal’s focus on research that informs nursing practice and builds on recent work in the journal on nurses’ safety voice (Ahn, 2026).</w:t>
       </w:r>
     </w:p>
     <w:p>

</xml_diff>